<commit_message>
Added VxKex 1.2.2.2316 original source code
</commit_message>
<xml_diff>
--- a/00-Documentation/Application Compatibility List.docx
+++ b/00-Documentation/Application Compatibility List.docx
@@ -320,13 +320,25 @@
         <w:rPr>
           <w:rFonts w:ascii="Calibri" w:eastAsia="Calibri" w:hAnsi="Calibri" w:cs="Calibri"/>
         </w:rPr>
-        <w:t>149.x</w:t>
-      </w:r>
-      <w:r>
-        <w:rPr>
-          <w:rFonts w:ascii="Calibri" w:eastAsia="Calibri" w:hAnsi="Calibri" w:cs="Calibri"/>
-        </w:rPr>
-        <w:t>, Ungoogled 147.x</w:t>
+        <w:t>152</w:t>
+      </w:r>
+      <w:r>
+        <w:rPr>
+          <w:rFonts w:ascii="Calibri" w:eastAsia="Calibri" w:hAnsi="Calibri" w:cs="Calibri"/>
+        </w:rPr>
+        <w:t>.x</w:t>
+      </w:r>
+      <w:r>
+        <w:rPr>
+          <w:rFonts w:ascii="Calibri" w:eastAsia="Calibri" w:hAnsi="Calibri" w:cs="Calibri"/>
+        </w:rPr>
+        <w:t>, Ungoogled 150</w:t>
+      </w:r>
+      <w:r>
+        <w:rPr>
+          <w:rFonts w:ascii="Calibri" w:eastAsia="Calibri" w:hAnsi="Calibri" w:cs="Calibri"/>
+        </w:rPr>
+        <w:t>.x</w:t>
       </w:r>
       <w:r>
         <w:rPr>
@@ -351,7 +363,15 @@
         <w:rPr>
           <w:rFonts w:ascii="Calibri" w:eastAsia="Calibri" w:hAnsi="Calibri" w:cs="Calibri"/>
         </w:rPr>
-        <w:t xml:space="preserve"> If this is important to you, use Supermium.</w:t>
+        <w:t xml:space="preserve"> If that</w:t>
+      </w:r>
+      <w:bookmarkStart w:id="0" w:name="_GoBack"/>
+      <w:bookmarkEnd w:id="0"/>
+      <w:r>
+        <w:rPr>
+          <w:rFonts w:ascii="Calibri" w:eastAsia="Calibri" w:hAnsi="Calibri" w:cs="Calibri"/>
+        </w:rPr>
+        <w:t xml:space="preserve"> is important to you, use Supermium.</w:t>
       </w:r>
     </w:p>
     <w:p>
@@ -1572,14 +1592,7 @@
           <w:rFonts w:ascii="Calibri" w:eastAsia="Calibri" w:hAnsi="Calibri" w:cs="Calibri"/>
         </w:rPr>
         <w:br/>
-        <w:t xml:space="preserve">In order to be able to uninstall Python, you need to enable VxKex and version spoof to Windows 8.1 for the </w:t>
-      </w:r>
-      <w:r>
-        <w:rPr>
-          <w:rFonts w:ascii="Calibri" w:eastAsia="Calibri" w:hAnsi="Calibri" w:cs="Calibri"/>
-        </w:rPr>
-        <w:lastRenderedPageBreak/>
-        <w:t>uninstaller. The uninstaller is located at "%LOCALAPPDATA%\Package Cache" inside one of the folders. It is usually the only EXE file present.</w:t>
+        <w:t>In order to be able to uninstall Python, you need to enable VxKex and version spoof to Windows 8.1 for the uninstaller. The uninstaller is located at "%LOCALAPPDATA%\Package Cache" inside one of the folders. It is usually the only EXE file present.</w:t>
       </w:r>
       <w:r>
         <w:rPr>
@@ -1673,8 +1686,6 @@
         </w:rPr>
         <w:t xml:space="preserve"> 2.3.3</w:t>
       </w:r>
-      <w:bookmarkStart w:id="0" w:name="_GoBack"/>
-      <w:bookmarkEnd w:id="0"/>
       <w:r>
         <w:rPr>
           <w:rFonts w:ascii="Calibri" w:eastAsia="Calibri" w:hAnsi="Calibri" w:cs="Calibri"/>
@@ -2367,19 +2378,7 @@
         <w:rPr>
           <w:rFonts w:ascii="Calibri" w:eastAsia="Calibri" w:hAnsi="Calibri" w:cs="Calibri"/>
         </w:rPr>
-        <w:t xml:space="preserve">Firefox (last known working version: </w:t>
-      </w:r>
-      <w:r>
-        <w:rPr>
-          <w:rFonts w:ascii="Calibri" w:eastAsia="Calibri" w:hAnsi="Calibri" w:cs="Calibri"/>
-        </w:rPr>
-        <w:t>123.0.1</w:t>
-      </w:r>
-      <w:r>
-        <w:rPr>
-          <w:rFonts w:ascii="Calibri" w:eastAsia="Calibri" w:hAnsi="Calibri" w:cs="Calibri"/>
-        </w:rPr>
-        <w:t>)</w:t>
+        <w:t>Firefox (last known working version: 123.0.1)</w:t>
       </w:r>
     </w:p>
     <w:p>
@@ -2394,7 +2393,6 @@
         <w:rPr>
           <w:rFonts w:ascii="Calibri" w:eastAsia="Calibri" w:hAnsi="Calibri" w:cs="Calibri"/>
         </w:rPr>
-        <w:lastRenderedPageBreak/>
         <w:t>Spotify</w:t>
       </w:r>
     </w:p>
@@ -3367,7 +3365,7 @@
 </file>
 
 <file path=customXml/itemProps1.xml><?xml version="1.0" encoding="utf-8"?>
-<ds:datastoreItem xmlns:ds="http://schemas.openxmlformats.org/officeDocument/2006/customXml" ds:itemID="{7E45A949-7981-4393-86A0-BC9A266DBD4F}">
+<ds:datastoreItem xmlns:ds="http://schemas.openxmlformats.org/officeDocument/2006/customXml" ds:itemID="{272F134B-BAD9-4733-B8FF-B0A925FDB1DD}">
   <ds:schemaRefs>
     <ds:schemaRef ds:uri="http://schemas.openxmlformats.org/officeDocument/2006/bibliography"/>
   </ds:schemaRefs>

</xml_diff>